<commit_message>
Add troubleshooting playbook and local health/security scripts.
Co-authored-by: Cursor <cursoragent@cursor.com>
</commit_message>
<xml_diff>
--- a/project-1-ansible-lab/docs/Ansible Playbooks.docx
+++ b/project-1-ansible-lab/docs/Ansible Playbooks.docx
@@ -1,6 +1,6 @@
 
 <file path=word/document.xml><?xml version="1.0" encoding="utf-8"?>
-<w:document xmlns:wpc="http://schemas.microsoft.com/office/word/2010/wordprocessingCanvas" xmlns:cx="http://schemas.microsoft.com/office/drawing/2014/chartex" xmlns:cx1="http://schemas.microsoft.com/office/drawing/2015/9/8/chartex" xmlns:cx2="http://schemas.microsoft.com/office/drawing/2015/10/21/chartex" xmlns:cx3="http://schemas.microsoft.com/office/drawing/2016/5/9/chartex" xmlns:cx4="http://schemas.microsoft.com/office/drawing/2016/5/10/chartex" xmlns:cx5="http://schemas.microsoft.com/office/drawing/2016/5/11/chartex" xmlns:cx6="http://schemas.microsoft.com/office/drawing/2016/5/12/chartex" xmlns:cx7="http://schemas.microsoft.com/office/drawing/2016/5/13/chartex" xmlns:cx8="http://schemas.microsoft.com/office/drawing/2016/5/14/chartex" xmlns:mc="http://schemas.openxmlformats.org/markup-compatibility/2006" xmlns:aink="http://schemas.microsoft.com/office/drawing/2016/ink" xmlns:am3d="http://schemas.microsoft.com/office/drawing/2017/model3d" xmlns:o="urn:schemas-microsoft-com:office:office" xmlns:oel="http://schemas.microsoft.com/office/2019/extlst" xmlns:r="http://schemas.openxmlformats.org/officeDocument/2006/relationships" xmlns:m="http://schemas.openxmlformats.org/officeDocument/2006/math" xmlns:v="urn:schemas-microsoft-com:vml" xmlns:wp14="http://schemas.microsoft.com/office/word/2010/wordprocessingDrawing" xmlns:wp="http://schemas.openxmlformats.org/drawingml/2006/wordprocessingDrawing" xmlns:w10="urn:schemas-microsoft-com:office:word" xmlns:w="http://schemas.openxmlformats.org/wordprocessingml/2006/main" xmlns:w14="http://schemas.microsoft.com/office/word/2010/wordml" xmlns:w15="http://schemas.microsoft.com/office/word/2012/wordml" xmlns:w16cex="http://schemas.microsoft.com/office/word/2018/wordml/cex" xmlns:w16cid="http://schemas.microsoft.com/office/word/2016/wordml/cid" xmlns:w16="http://schemas.microsoft.com/office/word/2018/wordml" xmlns:w16du="http://schemas.microsoft.com/office/word/2023/wordml/word16du" xmlns:w16sdtdh="http://schemas.microsoft.com/office/word/2020/wordml/sdtdatahash" xmlns:w16sdtfl="http://schemas.microsoft.com/office/word/2024/wordml/sdtformatlock" xmlns:w16se="http://schemas.microsoft.com/office/word/2015/wordml/symex" xmlns:wpg="http://schemas.microsoft.com/office/word/2010/wordprocessingGroup" xmlns:wpi="http://schemas.microsoft.com/office/word/2010/wordprocessingInk" xmlns:wne="http://schemas.microsoft.com/office/word/2006/wordml" xmlns:wps="http://schemas.microsoft.com/office/word/2010/wordprocessingShape" mc:Ignorable="w14 w15 w16se w16cid w16 w16cex w16sdtdh w16sdtfl w16du wp14">
+<w:document xmlns:wpc="http://schemas.microsoft.com/office/word/2010/wordprocessingCanvas" xmlns:cx="http://schemas.microsoft.com/office/drawing/2014/chartex" xmlns:cx1="http://schemas.microsoft.com/office/drawing/2015/9/8/chartex" xmlns:cx2="http://schemas.microsoft.com/office/drawing/2015/10/21/chartex" xmlns:cx3="http://schemas.microsoft.com/office/drawing/2016/5/9/chartex" xmlns:cx4="http://schemas.microsoft.com/office/drawing/2016/5/10/chartex" xmlns:cx5="http://schemas.microsoft.com/office/drawing/2016/5/11/chartex" xmlns:cx6="http://schemas.microsoft.com/office/drawing/2016/5/12/chartex" xmlns:cx7="http://schemas.microsoft.com/office/drawing/2016/5/13/chartex" xmlns:cx8="http://schemas.microsoft.com/office/drawing/2016/5/14/chartex" xmlns:mc="http://schemas.openxmlformats.org/markup-compatibility/2006" xmlns:aink="http://schemas.microsoft.com/office/drawing/2016/ink" xmlns:am3d="http://schemas.microsoft.com/office/drawing/2017/model3d" xmlns:o="urn:schemas-microsoft-com:office:office" xmlns:oel="http://schemas.microsoft.com/office/2019/extlst" xmlns:r="http://schemas.openxmlformats.org/officeDocument/2006/relationships" xmlns:m="http://schemas.openxmlformats.org/officeDocument/2006/math" xmlns:v="urn:schemas-microsoft-com:vml" xmlns:wp14="http://schemas.microsoft.com/office/word/2010/wordprocessingDrawing" xmlns:wp="http://schemas.openxmlformats.org/drawingml/2006/wordprocessingDrawing" xmlns:w10="urn:schemas-microsoft-com:office:word" xmlns:w="http://schemas.openxmlformats.org/wordprocessingml/2006/main" xmlns:w14="http://schemas.microsoft.com/office/word/2010/wordml" xmlns:w15="http://schemas.microsoft.com/office/word/2012/wordml" xmlns:w16cei="http://schemas.microsoft.com/office/word/2026/wordml/cei" xmlns:w16cex="http://schemas.microsoft.com/office/word/2018/wordml/cex" xmlns:w16cid="http://schemas.microsoft.com/office/word/2016/wordml/cid" xmlns:w16="http://schemas.microsoft.com/office/word/2018/wordml" xmlns:w16du="http://schemas.microsoft.com/office/word/2023/wordml/word16du" xmlns:w16sdtdh="http://schemas.microsoft.com/office/word/2020/wordml/sdtdatahash" xmlns:w16sdtfl="http://schemas.microsoft.com/office/word/2024/wordml/sdtformatlock" xmlns:w16se="http://schemas.microsoft.com/office/word/2015/wordml/symex" xmlns:wpg="http://schemas.microsoft.com/office/word/2010/wordprocessingGroup" xmlns:wpi="http://schemas.microsoft.com/office/word/2010/wordprocessingInk" xmlns:wne="http://schemas.microsoft.com/office/word/2006/wordml" xmlns:wps="http://schemas.microsoft.com/office/word/2010/wordprocessingShape" mc:Ignorable="w14 w15 w16se w16cid w16 w16cex w16sdtdh w16sdtfl w16du wp14">
   <w:body>
     <w:p>
       <w:pPr>
@@ -77,15 +77,7 @@
         </w:numPr>
       </w:pPr>
       <w:r>
-        <w:t>Installed packages (</w:t>
-      </w:r>
-      <w:proofErr w:type="spellStart"/>
-      <w:r>
-        <w:t>chrony</w:t>
-      </w:r>
-      <w:proofErr w:type="spellEnd"/>
-      <w:r>
-        <w:t>, curl, vim, rsync, Python bits)</w:t>
+        <w:t>Installed packages (chrony, curl, vim, rsync, Python bits)</w:t>
       </w:r>
     </w:p>
     <w:p>
@@ -109,13 +101,8 @@
         </w:numPr>
       </w:pPr>
       <w:r>
-        <w:t xml:space="preserve">Starts </w:t>
-      </w:r>
-      <w:proofErr w:type="spellStart"/>
-      <w:r>
-        <w:t>chronyd</w:t>
-      </w:r>
-      <w:proofErr w:type="spellEnd"/>
+        <w:t>Starts chronyd</w:t>
+      </w:r>
     </w:p>
     <w:p>
       <w:pPr>
@@ -180,15 +167,7 @@
         </w:numPr>
       </w:pPr>
       <w:r>
-        <w:t xml:space="preserve">Installs nginx (because </w:t>
-      </w:r>
-      <w:proofErr w:type="spellStart"/>
-      <w:r>
-        <w:t>web_stack</w:t>
-      </w:r>
-      <w:proofErr w:type="spellEnd"/>
-      <w:r>
-        <w:t>: nginx)</w:t>
+        <w:t>Installs nginx (because web_stack: nginx)</w:t>
       </w:r>
     </w:p>
     <w:p>
@@ -361,11 +340,20 @@
       </w:r>
     </w:p>
     <w:p>
-      <w:proofErr w:type="spellStart"/>
-      <w:r>
+      <w:pPr>
+        <w:pStyle w:val="Heading2"/>
+        <w:rPr>
+          <w:sz w:val="26"/>
+          <w:szCs w:val="26"/>
+        </w:rPr>
+      </w:pPr>
+      <w:r>
+        <w:rPr>
+          <w:sz w:val="26"/>
+          <w:szCs w:val="26"/>
+        </w:rPr>
         <w:t>SELinux.yml</w:t>
       </w:r>
-      <w:proofErr w:type="spellEnd"/>
     </w:p>
     <w:p>
       <w:r>
@@ -437,14 +425,9 @@
           <w:numId w:val="3"/>
         </w:numPr>
       </w:pPr>
-      <w:proofErr w:type="spellStart"/>
       <w:r>
         <w:lastRenderedPageBreak/>
-        <w:t>restorecon</w:t>
-      </w:r>
-      <w:proofErr w:type="spellEnd"/>
-      <w:r>
-        <w:t xml:space="preserve"> on web files</w:t>
+        <w:t>restorecon on web files</w:t>
       </w:r>
     </w:p>
     <w:p>
@@ -480,11 +463,7 @@
         </w:numPr>
       </w:pPr>
       <w:r>
-        <w:t xml:space="preserve">Installs </w:t>
-      </w:r>
-      <w:proofErr w:type="spellStart"/>
-      <w:r>
-        <w:t>lo</w:t>
+        <w:t>Installs lo</w:t>
       </w:r>
       <w:r>
         <w:t>g</w:t>
@@ -492,7 +471,6 @@
       <w:r>
         <w:t>rotate</w:t>
       </w:r>
-      <w:proofErr w:type="spellEnd"/>
     </w:p>
     <w:p>
       <w:pPr>
@@ -504,6 +482,17 @@
       </w:pPr>
       <w:r>
         <w:t>Drop /etc/logrotate.d/nginx-lab — weekly rotate/compress nginx logs, signal nginx to reopen logs</w:t>
+      </w:r>
+    </w:p>
+    <w:p>
+      <w:r>
+        <w:t>T</w:t>
+      </w:r>
+      <w:r>
+        <w:t>roubleshoot</w:t>
+      </w:r>
+      <w:r>
+        <w:t>.yml</w:t>
       </w:r>
     </w:p>
     <w:sectPr>
@@ -517,7 +506,7 @@
 </file>
 
 <file path=word/numbering.xml><?xml version="1.0" encoding="utf-8"?>
-<w:numbering xmlns:wpc="http://schemas.microsoft.com/office/word/2010/wordprocessingCanvas" xmlns:cx="http://schemas.microsoft.com/office/drawing/2014/chartex" xmlns:cx1="http://schemas.microsoft.com/office/drawing/2015/9/8/chartex" xmlns:cx2="http://schemas.microsoft.com/office/drawing/2015/10/21/chartex" xmlns:cx3="http://schemas.microsoft.com/office/drawing/2016/5/9/chartex" xmlns:cx4="http://schemas.microsoft.com/office/drawing/2016/5/10/chartex" xmlns:cx5="http://schemas.microsoft.com/office/drawing/2016/5/11/chartex" xmlns:cx6="http://schemas.microsoft.com/office/drawing/2016/5/12/chartex" xmlns:cx7="http://schemas.microsoft.com/office/drawing/2016/5/13/chartex" xmlns:cx8="http://schemas.microsoft.com/office/drawing/2016/5/14/chartex" xmlns:mc="http://schemas.openxmlformats.org/markup-compatibility/2006" xmlns:aink="http://schemas.microsoft.com/office/drawing/2016/ink" xmlns:am3d="http://schemas.microsoft.com/office/drawing/2017/model3d" xmlns:o="urn:schemas-microsoft-com:office:office" xmlns:oel="http://schemas.microsoft.com/office/2019/extlst" xmlns:r="http://schemas.openxmlformats.org/officeDocument/2006/relationships" xmlns:m="http://schemas.openxmlformats.org/officeDocument/2006/math" xmlns:v="urn:schemas-microsoft-com:vml" xmlns:wp14="http://schemas.microsoft.com/office/word/2010/wordprocessingDrawing" xmlns:wp="http://schemas.openxmlformats.org/drawingml/2006/wordprocessingDrawing" xmlns:w10="urn:schemas-microsoft-com:office:word" xmlns:w="http://schemas.openxmlformats.org/wordprocessingml/2006/main" xmlns:w14="http://schemas.microsoft.com/office/word/2010/wordml" xmlns:w15="http://schemas.microsoft.com/office/word/2012/wordml" xmlns:w16cex="http://schemas.microsoft.com/office/word/2018/wordml/cex" xmlns:w16cid="http://schemas.microsoft.com/office/word/2016/wordml/cid" xmlns:w16="http://schemas.microsoft.com/office/word/2018/wordml" xmlns:w16du="http://schemas.microsoft.com/office/word/2023/wordml/word16du" xmlns:w16sdtdh="http://schemas.microsoft.com/office/word/2020/wordml/sdtdatahash" xmlns:w16sdtfl="http://schemas.microsoft.com/office/word/2024/wordml/sdtformatlock" xmlns:w16se="http://schemas.microsoft.com/office/word/2015/wordml/symex" xmlns:wpg="http://schemas.microsoft.com/office/word/2010/wordprocessingGroup" xmlns:wpi="http://schemas.microsoft.com/office/word/2010/wordprocessingInk" xmlns:wne="http://schemas.microsoft.com/office/word/2006/wordml" xmlns:wps="http://schemas.microsoft.com/office/word/2010/wordprocessingShape" mc:Ignorable="w14 w15 w16se w16cid w16 w16cex w16sdtdh w16sdtfl w16du wp14">
+<w:numbering xmlns:wpc="http://schemas.microsoft.com/office/word/2010/wordprocessingCanvas" xmlns:cx="http://schemas.microsoft.com/office/drawing/2014/chartex" xmlns:cx1="http://schemas.microsoft.com/office/drawing/2015/9/8/chartex" xmlns:cx2="http://schemas.microsoft.com/office/drawing/2015/10/21/chartex" xmlns:cx3="http://schemas.microsoft.com/office/drawing/2016/5/9/chartex" xmlns:cx4="http://schemas.microsoft.com/office/drawing/2016/5/10/chartex" xmlns:cx5="http://schemas.microsoft.com/office/drawing/2016/5/11/chartex" xmlns:cx6="http://schemas.microsoft.com/office/drawing/2016/5/12/chartex" xmlns:cx7="http://schemas.microsoft.com/office/drawing/2016/5/13/chartex" xmlns:cx8="http://schemas.microsoft.com/office/drawing/2016/5/14/chartex" xmlns:mc="http://schemas.openxmlformats.org/markup-compatibility/2006" xmlns:aink="http://schemas.microsoft.com/office/drawing/2016/ink" xmlns:am3d="http://schemas.microsoft.com/office/drawing/2017/model3d" xmlns:o="urn:schemas-microsoft-com:office:office" xmlns:oel="http://schemas.microsoft.com/office/2019/extlst" xmlns:r="http://schemas.openxmlformats.org/officeDocument/2006/relationships" xmlns:m="http://schemas.openxmlformats.org/officeDocument/2006/math" xmlns:v="urn:schemas-microsoft-com:vml" xmlns:wp14="http://schemas.microsoft.com/office/word/2010/wordprocessingDrawing" xmlns:wp="http://schemas.openxmlformats.org/drawingml/2006/wordprocessingDrawing" xmlns:w10="urn:schemas-microsoft-com:office:word" xmlns:w="http://schemas.openxmlformats.org/wordprocessingml/2006/main" xmlns:w14="http://schemas.microsoft.com/office/word/2010/wordml" xmlns:w15="http://schemas.microsoft.com/office/word/2012/wordml" xmlns:w16cei="http://schemas.microsoft.com/office/word/2026/wordml/cei" xmlns:w16cex="http://schemas.microsoft.com/office/word/2018/wordml/cex" xmlns:w16cid="http://schemas.microsoft.com/office/word/2016/wordml/cid" xmlns:w16="http://schemas.microsoft.com/office/word/2018/wordml" xmlns:w16du="http://schemas.microsoft.com/office/word/2023/wordml/word16du" xmlns:w16sdtdh="http://schemas.microsoft.com/office/word/2020/wordml/sdtdatahash" xmlns:w16sdtfl="http://schemas.microsoft.com/office/word/2024/wordml/sdtformatlock" xmlns:w16se="http://schemas.microsoft.com/office/word/2015/wordml/symex" xmlns:wpg="http://schemas.microsoft.com/office/word/2010/wordprocessingGroup" xmlns:wpi="http://schemas.microsoft.com/office/word/2010/wordprocessingInk" xmlns:wne="http://schemas.microsoft.com/office/word/2006/wordml" xmlns:wps="http://schemas.microsoft.com/office/word/2010/wordprocessingShape" mc:Ignorable="w14 w15 w16se w16cid w16 w16cex w16sdtdh w16sdtfl w16du wp14">
   <w:abstractNum w:abstractNumId="0" w15:restartNumberingAfterBreak="0">
     <w:nsid w:val="11FC1865"/>
     <w:multiLevelType w:val="hybridMultilevel"/>
@@ -1471,6 +1460,7 @@
   <w:style w:type="character" w:default="1" w:styleId="DefaultParagraphFont">
     <w:name w:val="Default Paragraph Font"/>
     <w:uiPriority w:val="1"/>
+    <w:semiHidden/>
     <w:unhideWhenUsed/>
   </w:style>
   <w:style w:type="table" w:default="1" w:styleId="TableNormal">

</xml_diff>

<commit_message>
Update Ansible Playbooks documentation.
Co-authored-by: Cursor <cursoragent@cursor.com>
</commit_message>
<xml_diff>
--- a/project-1-ansible-lab/docs/Ansible Playbooks.docx
+++ b/project-1-ansible-lab/docs/Ansible Playbooks.docx
@@ -77,7 +77,15 @@
         </w:numPr>
       </w:pPr>
       <w:r>
-        <w:t>Installed packages (chrony, curl, vim, rsync, Python bits)</w:t>
+        <w:t>Installed packages (</w:t>
+      </w:r>
+      <w:proofErr w:type="spellStart"/>
+      <w:r>
+        <w:t>chrony</w:t>
+      </w:r>
+      <w:proofErr w:type="spellEnd"/>
+      <w:r>
+        <w:t>, curl, vim, rsync, Python bits)</w:t>
       </w:r>
     </w:p>
     <w:p>
@@ -101,8 +109,13 @@
         </w:numPr>
       </w:pPr>
       <w:r>
-        <w:t>Starts chronyd</w:t>
-      </w:r>
+        <w:t xml:space="preserve">Starts </w:t>
+      </w:r>
+      <w:proofErr w:type="spellStart"/>
+      <w:r>
+        <w:t>chronyd</w:t>
+      </w:r>
+      <w:proofErr w:type="spellEnd"/>
     </w:p>
     <w:p>
       <w:pPr>
@@ -113,7 +126,15 @@
         </w:numPr>
       </w:pPr>
       <w:r>
-        <w:t>Ensures Ansible user exist + user home ssh file “~/.ssh”</w:t>
+        <w:t xml:space="preserve">Ensures Ansible user </w:t>
+      </w:r>
+      <w:proofErr w:type="gramStart"/>
+      <w:r>
+        <w:t>exist</w:t>
+      </w:r>
+      <w:proofErr w:type="gramEnd"/>
+      <w:r>
+        <w:t xml:space="preserve"> + user home ssh file “~/.ssh”</w:t>
       </w:r>
     </w:p>
     <w:p>
@@ -124,8 +145,13 @@
           <w:numId w:val="1"/>
         </w:numPr>
       </w:pPr>
-      <w:r>
-        <w:t>Ensures passwordless sudo for ansible</w:t>
+      <w:proofErr w:type="gramStart"/>
+      <w:r>
+        <w:t>Ensures</w:t>
+      </w:r>
+      <w:proofErr w:type="gramEnd"/>
+      <w:r>
+        <w:t xml:space="preserve"> passwordless sudo for ansible</w:t>
       </w:r>
     </w:p>
     <w:p>
@@ -167,7 +193,15 @@
         </w:numPr>
       </w:pPr>
       <w:r>
-        <w:t>Installs nginx (because web_stack: nginx)</w:t>
+        <w:t xml:space="preserve">Installs nginx (because </w:t>
+      </w:r>
+      <w:proofErr w:type="spellStart"/>
+      <w:r>
+        <w:t>web_stack</w:t>
+      </w:r>
+      <w:proofErr w:type="spellEnd"/>
+      <w:r>
+        <w:t>: nginx)</w:t>
       </w:r>
     </w:p>
     <w:p>
@@ -282,7 +316,15 @@
         </w:numPr>
       </w:pPr>
       <w:r>
-        <w:t>Runs as root (become: true)</w:t>
+        <w:t>Runs as root (</w:t>
+      </w:r>
+      <w:proofErr w:type="gramStart"/>
+      <w:r>
+        <w:t>become:</w:t>
+      </w:r>
+      <w:proofErr w:type="gramEnd"/>
+      <w:r>
+        <w:t xml:space="preserve"> true)</w:t>
       </w:r>
       <w:r>
         <w:t xml:space="preserve"> – admin rights required</w:t>
@@ -336,7 +378,15 @@
         </w:numPr>
       </w:pPr>
       <w:r>
-        <w:t>Reboot optional .. disabled by default</w:t>
+        <w:t>Reboot optional</w:t>
+      </w:r>
+      <w:proofErr w:type="gramStart"/>
+      <w:r>
+        <w:t xml:space="preserve"> ..</w:t>
+      </w:r>
+      <w:proofErr w:type="gramEnd"/>
+      <w:r>
+        <w:t xml:space="preserve"> disabled by default</w:t>
       </w:r>
     </w:p>
     <w:p>
@@ -347,6 +397,7 @@
           <w:szCs w:val="26"/>
         </w:rPr>
       </w:pPr>
+      <w:proofErr w:type="spellStart"/>
       <w:r>
         <w:rPr>
           <w:sz w:val="26"/>
@@ -354,6 +405,7 @@
         </w:rPr>
         <w:t>SELinux.yml</w:t>
       </w:r>
+      <w:proofErr w:type="spellEnd"/>
     </w:p>
     <w:p>
       <w:r>
@@ -380,8 +432,13 @@
           <w:numId w:val="3"/>
         </w:numPr>
       </w:pPr>
-      <w:r>
-        <w:t xml:space="preserve">Allows me to </w:t>
+      <w:proofErr w:type="gramStart"/>
+      <w:r>
+        <w:t>Allows</w:t>
+      </w:r>
+      <w:proofErr w:type="gramEnd"/>
+      <w:r>
+        <w:t xml:space="preserve"> me to </w:t>
       </w:r>
       <w:r>
         <w:t xml:space="preserve">inspect/manage SELinux </w:t>
@@ -414,7 +471,15 @@
         <w:t xml:space="preserve"> - </w:t>
       </w:r>
       <w:r>
-        <w:t>via ansible.posix.selinux</w:t>
+        <w:t xml:space="preserve">via </w:t>
+      </w:r>
+      <w:proofErr w:type="gramStart"/>
+      <w:r>
+        <w:t>ansible.posix</w:t>
+      </w:r>
+      <w:proofErr w:type="gramEnd"/>
+      <w:r>
+        <w:t>.selinux</w:t>
       </w:r>
     </w:p>
     <w:p>
@@ -425,9 +490,14 @@
           <w:numId w:val="3"/>
         </w:numPr>
       </w:pPr>
+      <w:proofErr w:type="spellStart"/>
       <w:r>
         <w:lastRenderedPageBreak/>
-        <w:t>restorecon on web files</w:t>
+        <w:t>restorecon</w:t>
+      </w:r>
+      <w:proofErr w:type="spellEnd"/>
+      <w:r>
+        <w:t xml:space="preserve"> on web files</w:t>
       </w:r>
     </w:p>
     <w:p>
@@ -463,7 +533,11 @@
         </w:numPr>
       </w:pPr>
       <w:r>
-        <w:t>Installs lo</w:t>
+        <w:t xml:space="preserve">Installs </w:t>
+      </w:r>
+      <w:proofErr w:type="spellStart"/>
+      <w:r>
+        <w:t>lo</w:t>
       </w:r>
       <w:r>
         <w:t>g</w:t>
@@ -471,6 +545,7 @@
       <w:r>
         <w:t>rotate</w:t>
       </w:r>
+      <w:proofErr w:type="spellEnd"/>
     </w:p>
     <w:p>
       <w:pPr>
@@ -481,18 +556,342 @@
         </w:numPr>
       </w:pPr>
       <w:r>
-        <w:t>Drop /etc/logrotate.d/nginx-lab — weekly rotate/compress nginx logs, signal nginx to reopen logs</w:t>
-      </w:r>
-    </w:p>
-    <w:p>
-      <w:r>
+        <w:t>Drop /etc/</w:t>
+      </w:r>
+      <w:proofErr w:type="gramStart"/>
+      <w:r>
+        <w:t>logrotate.d</w:t>
+      </w:r>
+      <w:proofErr w:type="gramEnd"/>
+      <w:r>
+        <w:t>/nginx-lab — weekly rotate/compress nginx logs, signal nginx to reopen logs</w:t>
+      </w:r>
+    </w:p>
+    <w:p>
+      <w:pPr>
+        <w:pStyle w:val="Heading2"/>
+        <w:rPr>
+          <w:sz w:val="26"/>
+          <w:szCs w:val="26"/>
+        </w:rPr>
+      </w:pPr>
+      <w:proofErr w:type="spellStart"/>
+      <w:r>
+        <w:rPr>
+          <w:sz w:val="26"/>
+          <w:szCs w:val="26"/>
+        </w:rPr>
         <w:t>T</w:t>
       </w:r>
       <w:r>
+        <w:rPr>
+          <w:sz w:val="26"/>
+          <w:szCs w:val="26"/>
+        </w:rPr>
         <w:t>roubleshoot</w:t>
       </w:r>
       <w:r>
+        <w:rPr>
+          <w:sz w:val="26"/>
+          <w:szCs w:val="26"/>
+        </w:rPr>
         <w:t>.yml</w:t>
+      </w:r>
+      <w:proofErr w:type="spellEnd"/>
+    </w:p>
+    <w:p>
+      <w:r>
+        <w:t>G</w:t>
+      </w:r>
+      <w:r>
+        <w:t>athers a health/security snapshot from App-Node1 and App-Node2 and prints it.</w:t>
+      </w:r>
+    </w:p>
+    <w:p>
+      <w:r>
+        <w:t>On each node:</w:t>
+      </w:r>
+    </w:p>
+    <w:p>
+      <w:pPr>
+        <w:pStyle w:val="ListParagraph"/>
+        <w:numPr>
+          <w:ilvl w:val="0"/>
+          <w:numId w:val="5"/>
+        </w:numPr>
+      </w:pPr>
+      <w:r>
+        <w:t>Gathers facts</w:t>
+      </w:r>
+    </w:p>
+    <w:p>
+      <w:pPr>
+        <w:pStyle w:val="ListParagraph"/>
+        <w:numPr>
+          <w:ilvl w:val="1"/>
+          <w:numId w:val="5"/>
+        </w:numPr>
+      </w:pPr>
+      <w:r>
+        <w:t>OS</w:t>
+      </w:r>
+    </w:p>
+    <w:p>
+      <w:pPr>
+        <w:pStyle w:val="ListParagraph"/>
+        <w:numPr>
+          <w:ilvl w:val="1"/>
+          <w:numId w:val="5"/>
+        </w:numPr>
+      </w:pPr>
+      <w:r>
+        <w:t>IP</w:t>
+      </w:r>
+    </w:p>
+    <w:p>
+      <w:pPr>
+        <w:pStyle w:val="ListParagraph"/>
+        <w:numPr>
+          <w:ilvl w:val="1"/>
+          <w:numId w:val="5"/>
+        </w:numPr>
+      </w:pPr>
+      <w:r>
+        <w:t>CPU Cores</w:t>
+      </w:r>
+    </w:p>
+    <w:p>
+      <w:pPr>
+        <w:pStyle w:val="ListParagraph"/>
+        <w:numPr>
+          <w:ilvl w:val="1"/>
+          <w:numId w:val="5"/>
+        </w:numPr>
+      </w:pPr>
+      <w:r>
+        <w:t>Memory Totals</w:t>
+      </w:r>
+    </w:p>
+    <w:p>
+      <w:pPr>
+        <w:pStyle w:val="ListParagraph"/>
+        <w:numPr>
+          <w:ilvl w:val="0"/>
+          <w:numId w:val="5"/>
+        </w:numPr>
+      </w:pPr>
+      <w:r>
+        <w:t>Health</w:t>
+      </w:r>
+    </w:p>
+    <w:p>
+      <w:pPr>
+        <w:pStyle w:val="ListParagraph"/>
+        <w:numPr>
+          <w:ilvl w:val="1"/>
+          <w:numId w:val="5"/>
+        </w:numPr>
+      </w:pPr>
+      <w:r>
+        <w:t>Uptime</w:t>
+      </w:r>
+    </w:p>
+    <w:p>
+      <w:pPr>
+        <w:pStyle w:val="ListParagraph"/>
+        <w:numPr>
+          <w:ilvl w:val="1"/>
+          <w:numId w:val="5"/>
+        </w:numPr>
+      </w:pPr>
+      <w:proofErr w:type="gramStart"/>
+      <w:r>
+        <w:t>Free -m</w:t>
+      </w:r>
+      <w:proofErr w:type="gramEnd"/>
+    </w:p>
+    <w:p>
+      <w:pPr>
+        <w:pStyle w:val="ListParagraph"/>
+        <w:numPr>
+          <w:ilvl w:val="1"/>
+          <w:numId w:val="5"/>
+        </w:numPr>
+      </w:pPr>
+      <w:r>
+        <w:t>Df</w:t>
+      </w:r>
+    </w:p>
+    <w:p>
+      <w:pPr>
+        <w:pStyle w:val="ListParagraph"/>
+        <w:numPr>
+          <w:ilvl w:val="1"/>
+          <w:numId w:val="5"/>
+        </w:numPr>
+      </w:pPr>
+      <w:r>
+        <w:t>Top CPU Processes</w:t>
+      </w:r>
+    </w:p>
+    <w:p>
+      <w:pPr>
+        <w:pStyle w:val="ListParagraph"/>
+        <w:numPr>
+          <w:ilvl w:val="0"/>
+          <w:numId w:val="5"/>
+        </w:numPr>
+      </w:pPr>
+      <w:r>
+        <w:t xml:space="preserve">Services – Checks </w:t>
+      </w:r>
+      <w:r>
+        <w:t>active status</w:t>
+      </w:r>
+    </w:p>
+    <w:p>
+      <w:pPr>
+        <w:pStyle w:val="ListParagraph"/>
+        <w:numPr>
+          <w:ilvl w:val="1"/>
+          <w:numId w:val="5"/>
+        </w:numPr>
+      </w:pPr>
+      <w:r>
+        <w:t>Sshd</w:t>
+      </w:r>
+    </w:p>
+    <w:p>
+      <w:pPr>
+        <w:pStyle w:val="ListParagraph"/>
+        <w:numPr>
+          <w:ilvl w:val="1"/>
+          <w:numId w:val="5"/>
+        </w:numPr>
+      </w:pPr>
+      <w:proofErr w:type="spellStart"/>
+      <w:r>
+        <w:t>C</w:t>
+      </w:r>
+      <w:r>
+        <w:t>hronyd</w:t>
+      </w:r>
+      <w:proofErr w:type="spellEnd"/>
+    </w:p>
+    <w:p>
+      <w:pPr>
+        <w:pStyle w:val="ListParagraph"/>
+        <w:numPr>
+          <w:ilvl w:val="1"/>
+          <w:numId w:val="5"/>
+        </w:numPr>
+      </w:pPr>
+      <w:r>
+        <w:t>Firewalld</w:t>
+      </w:r>
+    </w:p>
+    <w:p>
+      <w:pPr>
+        <w:pStyle w:val="ListParagraph"/>
+        <w:numPr>
+          <w:ilvl w:val="1"/>
+          <w:numId w:val="5"/>
+        </w:numPr>
+      </w:pPr>
+      <w:r>
+        <w:t>Nginx</w:t>
+      </w:r>
+    </w:p>
+    <w:p>
+      <w:pPr>
+        <w:pStyle w:val="ListParagraph"/>
+        <w:numPr>
+          <w:ilvl w:val="0"/>
+          <w:numId w:val="5"/>
+        </w:numPr>
+      </w:pPr>
+      <w:r>
+        <w:t>Network</w:t>
+      </w:r>
+    </w:p>
+    <w:p>
+      <w:pPr>
+        <w:pStyle w:val="ListParagraph"/>
+        <w:numPr>
+          <w:ilvl w:val="1"/>
+          <w:numId w:val="5"/>
+        </w:numPr>
+      </w:pPr>
+      <w:r>
+        <w:t>Listening TCP and UDP ports</w:t>
+      </w:r>
+      <w:r>
+        <w:t xml:space="preserve"> (ss)</w:t>
+      </w:r>
+    </w:p>
+    <w:p>
+      <w:pPr>
+        <w:pStyle w:val="ListParagraph"/>
+        <w:numPr>
+          <w:ilvl w:val="0"/>
+          <w:numId w:val="5"/>
+        </w:numPr>
+      </w:pPr>
+      <w:r>
+        <w:t>Security</w:t>
+      </w:r>
+    </w:p>
+    <w:p>
+      <w:pPr>
+        <w:pStyle w:val="ListParagraph"/>
+        <w:numPr>
+          <w:ilvl w:val="1"/>
+          <w:numId w:val="5"/>
+        </w:numPr>
+      </w:pPr>
+      <w:r>
+        <w:t>“getenforce”</w:t>
+      </w:r>
+      <w:r>
+        <w:t xml:space="preserve"> recent failed ssh/auth lines, recent SELinux AVC hints</w:t>
+      </w:r>
+    </w:p>
+    <w:p>
+      <w:pPr>
+        <w:pStyle w:val="ListParagraph"/>
+        <w:numPr>
+          <w:ilvl w:val="0"/>
+          <w:numId w:val="5"/>
+        </w:numPr>
+      </w:pPr>
+      <w:proofErr w:type="spellStart"/>
+      <w:r>
+        <w:t>Changed_when</w:t>
+      </w:r>
+      <w:proofErr w:type="spellEnd"/>
+      <w:r>
+        <w:t>: false</w:t>
+      </w:r>
+    </w:p>
+    <w:p>
+      <w:pPr>
+        <w:pStyle w:val="ListParagraph"/>
+        <w:numPr>
+          <w:ilvl w:val="1"/>
+          <w:numId w:val="5"/>
+        </w:numPr>
+      </w:pPr>
+      <w:r>
+        <w:t xml:space="preserve">Meaning safe to re-run – won’t </w:t>
+      </w:r>
+      <w:r>
+        <w:t>“</w:t>
+      </w:r>
+      <w:r>
+        <w:t>change</w:t>
+      </w:r>
+      <w:r>
+        <w:t>” server configurations</w:t>
       </w:r>
     </w:p>
     <w:sectPr>
@@ -621,6 +1020,232 @@
     </w:lvl>
   </w:abstractNum>
   <w:abstractNum w:abstractNumId="1" w15:restartNumberingAfterBreak="0">
+    <w:nsid w:val="23343B95"/>
+    <w:multiLevelType w:val="hybridMultilevel"/>
+    <w:tmpl w:val="E996DCD8"/>
+    <w:lvl w:ilvl="0" w:tplc="04090001">
+      <w:start w:val="1"/>
+      <w:numFmt w:val="bullet"/>
+      <w:lvlText w:val=""/>
+      <w:lvlJc w:val="left"/>
+      <w:pPr>
+        <w:ind w:left="720" w:hanging="360"/>
+      </w:pPr>
+      <w:rPr>
+        <w:rFonts w:ascii="Symbol" w:hAnsi="Symbol" w:hint="default"/>
+      </w:rPr>
+    </w:lvl>
+    <w:lvl w:ilvl="1" w:tplc="04090003" w:tentative="1">
+      <w:start w:val="1"/>
+      <w:numFmt w:val="bullet"/>
+      <w:lvlText w:val="o"/>
+      <w:lvlJc w:val="left"/>
+      <w:pPr>
+        <w:ind w:left="1440" w:hanging="360"/>
+      </w:pPr>
+      <w:rPr>
+        <w:rFonts w:ascii="Courier New" w:hAnsi="Courier New" w:cs="Courier New" w:hint="default"/>
+      </w:rPr>
+    </w:lvl>
+    <w:lvl w:ilvl="2" w:tplc="04090005" w:tentative="1">
+      <w:start w:val="1"/>
+      <w:numFmt w:val="bullet"/>
+      <w:lvlText w:val=""/>
+      <w:lvlJc w:val="left"/>
+      <w:pPr>
+        <w:ind w:left="2160" w:hanging="360"/>
+      </w:pPr>
+      <w:rPr>
+        <w:rFonts w:ascii="Wingdings" w:hAnsi="Wingdings" w:hint="default"/>
+      </w:rPr>
+    </w:lvl>
+    <w:lvl w:ilvl="3" w:tplc="04090001" w:tentative="1">
+      <w:start w:val="1"/>
+      <w:numFmt w:val="bullet"/>
+      <w:lvlText w:val=""/>
+      <w:lvlJc w:val="left"/>
+      <w:pPr>
+        <w:ind w:left="2880" w:hanging="360"/>
+      </w:pPr>
+      <w:rPr>
+        <w:rFonts w:ascii="Symbol" w:hAnsi="Symbol" w:hint="default"/>
+      </w:rPr>
+    </w:lvl>
+    <w:lvl w:ilvl="4" w:tplc="04090003" w:tentative="1">
+      <w:start w:val="1"/>
+      <w:numFmt w:val="bullet"/>
+      <w:lvlText w:val="o"/>
+      <w:lvlJc w:val="left"/>
+      <w:pPr>
+        <w:ind w:left="3600" w:hanging="360"/>
+      </w:pPr>
+      <w:rPr>
+        <w:rFonts w:ascii="Courier New" w:hAnsi="Courier New" w:cs="Courier New" w:hint="default"/>
+      </w:rPr>
+    </w:lvl>
+    <w:lvl w:ilvl="5" w:tplc="04090005" w:tentative="1">
+      <w:start w:val="1"/>
+      <w:numFmt w:val="bullet"/>
+      <w:lvlText w:val=""/>
+      <w:lvlJc w:val="left"/>
+      <w:pPr>
+        <w:ind w:left="4320" w:hanging="360"/>
+      </w:pPr>
+      <w:rPr>
+        <w:rFonts w:ascii="Wingdings" w:hAnsi="Wingdings" w:hint="default"/>
+      </w:rPr>
+    </w:lvl>
+    <w:lvl w:ilvl="6" w:tplc="04090001" w:tentative="1">
+      <w:start w:val="1"/>
+      <w:numFmt w:val="bullet"/>
+      <w:lvlText w:val=""/>
+      <w:lvlJc w:val="left"/>
+      <w:pPr>
+        <w:ind w:left="5040" w:hanging="360"/>
+      </w:pPr>
+      <w:rPr>
+        <w:rFonts w:ascii="Symbol" w:hAnsi="Symbol" w:hint="default"/>
+      </w:rPr>
+    </w:lvl>
+    <w:lvl w:ilvl="7" w:tplc="04090003" w:tentative="1">
+      <w:start w:val="1"/>
+      <w:numFmt w:val="bullet"/>
+      <w:lvlText w:val="o"/>
+      <w:lvlJc w:val="left"/>
+      <w:pPr>
+        <w:ind w:left="5760" w:hanging="360"/>
+      </w:pPr>
+      <w:rPr>
+        <w:rFonts w:ascii="Courier New" w:hAnsi="Courier New" w:cs="Courier New" w:hint="default"/>
+      </w:rPr>
+    </w:lvl>
+    <w:lvl w:ilvl="8" w:tplc="04090005" w:tentative="1">
+      <w:start w:val="1"/>
+      <w:numFmt w:val="bullet"/>
+      <w:lvlText w:val=""/>
+      <w:lvlJc w:val="left"/>
+      <w:pPr>
+        <w:ind w:left="6480" w:hanging="360"/>
+      </w:pPr>
+      <w:rPr>
+        <w:rFonts w:ascii="Wingdings" w:hAnsi="Wingdings" w:hint="default"/>
+      </w:rPr>
+    </w:lvl>
+  </w:abstractNum>
+  <w:abstractNum w:abstractNumId="2" w15:restartNumberingAfterBreak="0">
+    <w:nsid w:val="317E5C28"/>
+    <w:multiLevelType w:val="hybridMultilevel"/>
+    <w:tmpl w:val="7DEA14A4"/>
+    <w:lvl w:ilvl="0" w:tplc="04090001">
+      <w:start w:val="1"/>
+      <w:numFmt w:val="bullet"/>
+      <w:lvlText w:val=""/>
+      <w:lvlJc w:val="left"/>
+      <w:pPr>
+        <w:ind w:left="720" w:hanging="360"/>
+      </w:pPr>
+      <w:rPr>
+        <w:rFonts w:ascii="Symbol" w:hAnsi="Symbol" w:hint="default"/>
+      </w:rPr>
+    </w:lvl>
+    <w:lvl w:ilvl="1" w:tplc="04090003">
+      <w:start w:val="1"/>
+      <w:numFmt w:val="bullet"/>
+      <w:lvlText w:val="o"/>
+      <w:lvlJc w:val="left"/>
+      <w:pPr>
+        <w:ind w:left="1440" w:hanging="360"/>
+      </w:pPr>
+      <w:rPr>
+        <w:rFonts w:ascii="Courier New" w:hAnsi="Courier New" w:cs="Courier New" w:hint="default"/>
+      </w:rPr>
+    </w:lvl>
+    <w:lvl w:ilvl="2" w:tplc="04090005" w:tentative="1">
+      <w:start w:val="1"/>
+      <w:numFmt w:val="bullet"/>
+      <w:lvlText w:val=""/>
+      <w:lvlJc w:val="left"/>
+      <w:pPr>
+        <w:ind w:left="2160" w:hanging="360"/>
+      </w:pPr>
+      <w:rPr>
+        <w:rFonts w:ascii="Wingdings" w:hAnsi="Wingdings" w:hint="default"/>
+      </w:rPr>
+    </w:lvl>
+    <w:lvl w:ilvl="3" w:tplc="04090001" w:tentative="1">
+      <w:start w:val="1"/>
+      <w:numFmt w:val="bullet"/>
+      <w:lvlText w:val=""/>
+      <w:lvlJc w:val="left"/>
+      <w:pPr>
+        <w:ind w:left="2880" w:hanging="360"/>
+      </w:pPr>
+      <w:rPr>
+        <w:rFonts w:ascii="Symbol" w:hAnsi="Symbol" w:hint="default"/>
+      </w:rPr>
+    </w:lvl>
+    <w:lvl w:ilvl="4" w:tplc="04090003" w:tentative="1">
+      <w:start w:val="1"/>
+      <w:numFmt w:val="bullet"/>
+      <w:lvlText w:val="o"/>
+      <w:lvlJc w:val="left"/>
+      <w:pPr>
+        <w:ind w:left="3600" w:hanging="360"/>
+      </w:pPr>
+      <w:rPr>
+        <w:rFonts w:ascii="Courier New" w:hAnsi="Courier New" w:cs="Courier New" w:hint="default"/>
+      </w:rPr>
+    </w:lvl>
+    <w:lvl w:ilvl="5" w:tplc="04090005" w:tentative="1">
+      <w:start w:val="1"/>
+      <w:numFmt w:val="bullet"/>
+      <w:lvlText w:val=""/>
+      <w:lvlJc w:val="left"/>
+      <w:pPr>
+        <w:ind w:left="4320" w:hanging="360"/>
+      </w:pPr>
+      <w:rPr>
+        <w:rFonts w:ascii="Wingdings" w:hAnsi="Wingdings" w:hint="default"/>
+      </w:rPr>
+    </w:lvl>
+    <w:lvl w:ilvl="6" w:tplc="04090001" w:tentative="1">
+      <w:start w:val="1"/>
+      <w:numFmt w:val="bullet"/>
+      <w:lvlText w:val=""/>
+      <w:lvlJc w:val="left"/>
+      <w:pPr>
+        <w:ind w:left="5040" w:hanging="360"/>
+      </w:pPr>
+      <w:rPr>
+        <w:rFonts w:ascii="Symbol" w:hAnsi="Symbol" w:hint="default"/>
+      </w:rPr>
+    </w:lvl>
+    <w:lvl w:ilvl="7" w:tplc="04090003" w:tentative="1">
+      <w:start w:val="1"/>
+      <w:numFmt w:val="bullet"/>
+      <w:lvlText w:val="o"/>
+      <w:lvlJc w:val="left"/>
+      <w:pPr>
+        <w:ind w:left="5760" w:hanging="360"/>
+      </w:pPr>
+      <w:rPr>
+        <w:rFonts w:ascii="Courier New" w:hAnsi="Courier New" w:cs="Courier New" w:hint="default"/>
+      </w:rPr>
+    </w:lvl>
+    <w:lvl w:ilvl="8" w:tplc="04090005" w:tentative="1">
+      <w:start w:val="1"/>
+      <w:numFmt w:val="bullet"/>
+      <w:lvlText w:val=""/>
+      <w:lvlJc w:val="left"/>
+      <w:pPr>
+        <w:ind w:left="6480" w:hanging="360"/>
+      </w:pPr>
+      <w:rPr>
+        <w:rFonts w:ascii="Wingdings" w:hAnsi="Wingdings" w:hint="default"/>
+      </w:rPr>
+    </w:lvl>
+  </w:abstractNum>
+  <w:abstractNum w:abstractNumId="3" w15:restartNumberingAfterBreak="0">
     <w:nsid w:val="35246290"/>
     <w:multiLevelType w:val="hybridMultilevel"/>
     <w:tmpl w:val="0F7A2256"/>
@@ -733,7 +1358,7 @@
       </w:rPr>
     </w:lvl>
   </w:abstractNum>
-  <w:abstractNum w:abstractNumId="2" w15:restartNumberingAfterBreak="0">
+  <w:abstractNum w:abstractNumId="4" w15:restartNumberingAfterBreak="0">
     <w:nsid w:val="548C40C6"/>
     <w:multiLevelType w:val="hybridMultilevel"/>
     <w:tmpl w:val="712AD786"/>
@@ -847,13 +1472,19 @@
     </w:lvl>
   </w:abstractNum>
   <w:num w:numId="1" w16cid:durableId="1997176475">
-    <w:abstractNumId w:val="2"/>
+    <w:abstractNumId w:val="4"/>
   </w:num>
   <w:num w:numId="2" w16cid:durableId="1565949303">
     <w:abstractNumId w:val="0"/>
   </w:num>
   <w:num w:numId="3" w16cid:durableId="93601116">
+    <w:abstractNumId w:val="3"/>
+  </w:num>
+  <w:num w:numId="4" w16cid:durableId="568074996">
     <w:abstractNumId w:val="1"/>
+  </w:num>
+  <w:num w:numId="5" w16cid:durableId="1132139271">
+    <w:abstractNumId w:val="2"/>
   </w:num>
 </w:numbering>
 </file>
@@ -1460,7 +2091,6 @@
   <w:style w:type="character" w:default="1" w:styleId="DefaultParagraphFont">
     <w:name w:val="Default Paragraph Font"/>
     <w:uiPriority w:val="1"/>
-    <w:semiHidden/>
     <w:unhideWhenUsed/>
   </w:style>
   <w:style w:type="table" w:default="1" w:styleId="TableNormal">

</xml_diff>

<commit_message>
Update Project 1 playbooks doc and add what-was-implemented overview.
Co-authored-by: Cursor <cursoragent@cursor.com>
</commit_message>
<xml_diff>
--- a/project-1-ansible-lab/docs/Ansible Playbooks.docx
+++ b/project-1-ansible-lab/docs/Ansible Playbooks.docx
@@ -213,14 +213,7 @@
         </w:numPr>
       </w:pPr>
       <w:r>
-        <w:t>Installs/starts </w:t>
-      </w:r>
-      <w:r>
-        <w:rPr>
-          <w:b/>
-          <w:bCs/>
-        </w:rPr>
-        <w:t>firewalld</w:t>
+        <w:t>Installs/starts firewalld</w:t>
       </w:r>
     </w:p>
     <w:p>
@@ -232,17 +225,7 @@
         </w:numPr>
       </w:pPr>
       <w:r>
-        <w:t>Opens </w:t>
-      </w:r>
-      <w:r>
-        <w:rPr>
-          <w:b/>
-          <w:bCs/>
-        </w:rPr>
-        <w:t>HTTP/HTTPS</w:t>
-      </w:r>
-      <w:r>
-        <w:t> in firewalld</w:t>
+        <w:t>Opens HTTP/HTTPS in firewalld</w:t>
       </w:r>
     </w:p>
     <w:p>
@@ -254,17 +237,7 @@
         </w:numPr>
       </w:pPr>
       <w:r>
-        <w:t>Deploys a </w:t>
-      </w:r>
-      <w:r>
-        <w:rPr>
-          <w:b/>
-          <w:bCs/>
-        </w:rPr>
-        <w:t>templated index page</w:t>
-      </w:r>
-      <w:r>
-        <w:t> (+ architecture image)</w:t>
+        <w:t>Deploys a templated index page (+ architecture image)</w:t>
       </w:r>
     </w:p>
     <w:p>
@@ -276,14 +249,7 @@
         </w:numPr>
       </w:pPr>
       <w:r>
-        <w:t>Enables and starts </w:t>
-      </w:r>
-      <w:r>
-        <w:rPr>
-          <w:b/>
-          <w:bCs/>
-        </w:rPr>
-        <w:t>nginx</w:t>
+        <w:t>Enables and starts nginx</w:t>
       </w:r>
     </w:p>
     <w:p>
@@ -2091,6 +2057,7 @@
   <w:style w:type="character" w:default="1" w:styleId="DefaultParagraphFont">
     <w:name w:val="Default Paragraph Font"/>
     <w:uiPriority w:val="1"/>
+    <w:semiHidden/>
     <w:unhideWhenUsed/>
   </w:style>
   <w:style w:type="table" w:default="1" w:styleId="TableNormal">

</xml_diff>